<commit_message>
backup: tự động 28/10/2026 07:12 (167 tệp)
</commit_message>
<xml_diff>
--- a/30-Ket-Qua/2026-10-24/Soan-Thao-lan-3/Ban-sach/BC_Tiep-thu-giai-trinh-lan-5-De-an-Dang-kiem_20261024_v7_ban-sach.docx
+++ b/30-Ket-Qua/2026-10-24/Soan-Thao-lan-3/Ban-sach/BC_Tiep-thu-giai-trinh-lan-5-De-an-Dang-kiem_20261024_v7_ban-sach.docx
@@ -417,22 +417,12 @@
     <w:p>
       <w:pPr>
         <w:spacing w:after="0"/>
-        <w:ind w:left="720" w:firstLine="720"/>
+        <w:jc w:val="center"/>
         <w:rPr>
           <w:b/>
-          <w:color w:val="FF0000"/>
-          <w:sz w:val="18"/>
-          <w:szCs w:val="12"/>
           <w:lang w:val="nl-NL"/>
         </w:rPr>
       </w:pPr>
-      <w:r>
-        <w:rPr>
-          <w:b/>
-          <w:color w:val="FF0000"/>
-        </w:rPr>
-        <w:t>DỰ THẢO</w:t>
-      </w:r>
     </w:p>
     <w:p>
       <w:pPr>
@@ -607,7 +597,7 @@
     </w:p>
     <w:tbl>
       <w:tblPr>
-        <w:tblW w:w="13745" w:type="dxa"/>
+        <w:tblW w:w="14029" w:type="dxa"/>
         <w:jc w:val="center"/>
         <w:tblLayout w:type="fixed"/>
         <w:tblLook w:val="04A0" w:firstRow="1" w:lastRow="0" w:firstColumn="1" w:lastColumn="0" w:noHBand="0" w:noVBand="1"/>
@@ -615,7 +605,7 @@
       <w:tblGrid>
         <w:gridCol w:w="704"/>
         <w:gridCol w:w="3969"/>
-        <w:gridCol w:w="9072"/>
+        <w:gridCol w:w="9356"/>
       </w:tblGrid>
       <w:tr>
         <w:trPr>
@@ -675,7 +665,7 @@
         </w:tc>
         <w:tc>
           <w:tcPr>
-            <w:tcW w:w="9072" w:type="dxa"/>
+            <w:tcW w:w="9356" w:type="dxa"/>
             <w:tcBorders>
               <w:top w:val="single" w:sz="4" w:space="0" w:color="000000"/>
               <w:left w:val="single" w:sz="4" w:space="0" w:color="000000"/>
@@ -735,7 +725,7 @@
         </w:tc>
         <w:tc>
           <w:tcPr>
-            <w:tcW w:w="13041" w:type="dxa"/>
+            <w:tcW w:w="13325" w:type="dxa"/>
             <w:gridSpan w:val="2"/>
             <w:tcBorders>
               <w:top w:val="single" w:sz="4" w:space="0" w:color="000000"/>
@@ -834,7 +824,7 @@
         </w:tc>
         <w:tc>
           <w:tcPr>
-            <w:tcW w:w="9072" w:type="dxa"/>
+            <w:tcW w:w="9356" w:type="dxa"/>
             <w:tcBorders>
               <w:top w:val="single" w:sz="4" w:space="0" w:color="000000"/>
               <w:left w:val="single" w:sz="4" w:space="0" w:color="000000"/>
@@ -847,9 +837,6 @@
             <w:pPr>
               <w:spacing w:after="40" w:line="240" w:lineRule="auto"/>
               <w:jc w:val="both"/>
-              <w:rPr>
-                <w:color w:val="FF0000"/>
-              </w:rPr>
             </w:pPr>
             <w:r>
               <w:rPr>
@@ -906,62 +893,22 @@
               <w:rPr>
                 <w:i/>
                 <w:iCs/>
-                <w:color w:val="00B050"/>
               </w:rPr>
               <w:t>Như vậy, việc Trường góp vốn cùng nhà đầu tư hình thành pháp nhân mới có cơ sở ở cấp luật, nghị định (cơ sở giáo dục nghề nghiệp được thành lập doanh nghiệp khi đủ điều kiện; đơn vị sự nghiệp công lập được liên doanh, liên kết theo hình thức hình thành pháp nhân mới), nhưng chưa có hướng dẫn chi tiết về điều kiện, trình tự, thẩm quyền và cơ chế quản lý phần vốn góp bằng tiền; do đó cần có ý kiến hướng dẫn của Bộ Tài chính, Bộ Nội vụ trước khi thực hiện.</w:t>
             </w:r>
             <w:r>
-              <w:rPr>
-                <w:color w:val="00B050"/>
-              </w:rPr>
-              <w:t xml:space="preserve"> </w:t>
-            </w:r>
-            <w:r>
-              <w:rPr>
-                <w:color w:val="00B050"/>
-              </w:rPr>
-              <w:t>Nhà trường tiếp thu ý kiến, bổ sung các căn cứ nêu trên vào Bảng 6 Mục III Phần II Đề án</w:t>
-            </w:r>
-            <w:r>
-              <w:rPr>
-                <w:color w:val="00B050"/>
-              </w:rPr>
-              <w:t xml:space="preserve">; đồng thời làm rõ Trung tâm phục vụ trực tiếp hoạt động đào tạo ngành, nghề Công nghệ ô tô </w:t>
-            </w:r>
-            <w:r>
-              <w:rPr>
-                <w:color w:val="00B050"/>
-              </w:rPr>
-              <w:t>(</w:t>
-            </w:r>
-            <w:r>
-              <w:rPr>
-                <w:color w:val="00B050"/>
-              </w:rPr>
-              <w:t>nay là Công nghệ kỹ thuật ô tô</w:t>
-            </w:r>
-            <w:r>
-              <w:rPr>
-                <w:color w:val="00B050"/>
-              </w:rPr>
-              <w:t xml:space="preserve">) </w:t>
-            </w:r>
-            <w:r>
-              <w:rPr>
-                <w:color w:val="00B050"/>
-              </w:rPr>
+              <w:t xml:space="preserve"> Nhà trường tiếp thu ý kiến, bổ sung các căn cứ nêu trên vào Bảng 6 Mục III Phần II Đề án; đồng thời làm rõ Trung tâm phục vụ trực tiếp hoạt động đào tạo ngành, nghề Công nghệ ô tô </w:t>
+            </w:r>
+            <w:r>
+              <w:t xml:space="preserve">(nay là Công nghệ kỹ thuật ô tô) </w:t>
+            </w:r>
+            <w:r>
               <w:t xml:space="preserve">của Trường (thực hành, thực tập, </w:t>
             </w:r>
             <w:r>
-              <w:rPr>
-                <w:color w:val="00B050"/>
-              </w:rPr>
               <w:t>kiểm định ô tô</w:t>
             </w:r>
             <w:r>
-              <w:rPr>
-                <w:color w:val="00B050"/>
-              </w:rPr>
               <w:t>) để đáp ứng điều kiện “phục vụ hoạt động giáo dục nghề nghiệp” tại điểm e khoản 1 Điều 11 Luật Giáo dục nghề nghiệp.</w:t>
             </w:r>
           </w:p>
@@ -973,7 +920,6 @@
             <w:r>
               <w:rPr>
                 <w:iCs/>
-                <w:color w:val="00B050"/>
               </w:rPr>
               <w:t>Cập nhật văn bản mới ban hành sau khi Trường trình Đề án: (v) điểm b khoản 3 Điều 8 Quy định số 224-QĐ/TW ngày 14/10/2026 của Ban Chấp hành Trung ương về đảng viên tham gia hoạt động đầu tư kinh doanh cho phép viên chức giữ chức vụ quản lý được “cử tham gia quản lý hoặc làm đại diện phần vốn, tài sản của đơn vị tại tổ chức kinh tế theo quy định của pháp luật”, cho thấy quy định của Đảng đã tính đến trường hợp đơn vị có phần vốn, tài sản tại tổ chức kinh tế; đây là căn cứ tham khảo, không thay thế quy định của pháp luật về thẩm quyền, trình tự góp vốn; (vi) Điều 18 Nghị định số 373/2026/NĐ-CP ngày 30/9/2026 của Chính phủ về chuyển đơn vị sự nghiệp công lập thành doanh nghiệp quy định việc xử lý “các khoản đầu tư tài chính” của đơn vị sự nghiệp công lập khi chuyển đổi. Qua tra cứu, đến nay chưa có văn bản hướng dẫn riêng của Bộ Tài chính về trình tự đơn vị sự nghiệp công lập góp vốn bằng tiền thành lập pháp nhân mới; đây là cơ sở để nhà trường kiến nghị xin ý kiến hướng dẫn tại điểm b mục này.</w:t>
             </w:r>
@@ -1064,14 +1010,10 @@
               <w:rPr>
                 <w:b/>
                 <w:bCs/>
-                <w:color w:val="00B050"/>
               </w:rPr>
               <w:t xml:space="preserve">c) Điều chỉnh hồ sơ: </w:t>
             </w:r>
             <w:r>
-              <w:rPr>
-                <w:color w:val="00B050"/>
-              </w:rPr>
               <w:t>Đề án (Bảng 6; Mục IV, V Phần II về quản lý phần vốn); Tờ trình (phần Căn cứ và Mục IV “Vấn đề còn có ý kiến khác nhau”, nêu rõ nội dung xin hướng dẫn); dự thảo Quyết định (điều khoản về đại diện phần vốn, giao trách nhiệm xin ý kiến Bộ Tài chính).</w:t>
             </w:r>
           </w:p>
@@ -1126,7 +1068,7 @@
         </w:tc>
         <w:tc>
           <w:tcPr>
-            <w:tcW w:w="9072" w:type="dxa"/>
+            <w:tcW w:w="9356" w:type="dxa"/>
             <w:tcBorders>
               <w:top w:val="single" w:sz="4" w:space="0" w:color="000000"/>
               <w:left w:val="single" w:sz="4" w:space="0" w:color="000000"/>
@@ -1184,29 +1126,7 @@
               <w:t xml:space="preserve">công nghệ </w:t>
             </w:r>
             <w:r>
-              <w:t>đăng kiểm), đây là điểm khác biệt so với cơ sở đăng kiểm thuần thương mại.</w:t>
-            </w:r>
-            <w:r>
-              <w:rPr>
-                <w:color w:val="00B050"/>
-              </w:rPr>
-              <w:t xml:space="preserve"> Bên cạnh đó, Trung tâm 82.01.S là đơn vị sự nghiệp công lập đang thực hiện thủ tục chuyển đổi (cổ phần hóa); từ ngày 30/9/2026, việc chuyển đổi thực hiện theo Nghị định số 373/2026/NĐ-CP. </w:t>
-            </w:r>
-          </w:p>
-          <w:p>
-            <w:pPr>
-              <w:spacing w:after="40" w:line="240" w:lineRule="auto"/>
-              <w:jc w:val="both"/>
-              <w:rPr>
-                <w:color w:val="FF0000"/>
-              </w:rPr>
-            </w:pPr>
-            <w:r>
-              <w:rPr>
-                <w:bCs/>
-                <w:color w:val="00B050"/>
-              </w:rPr>
-              <w:t>b) Tiếp thu điều chỉnh quy mô: Nhà trường cập nhật dự báo nhu cầu kiểm định có tính đến năng lực của Trung tâm 82.01.S và dự án An Phú Đăk Hà, và điều chỉnh quy mô theo hướng phân kỳ đầu tư: giai đoạn 1 đầu tư 01 dây chuyền kiểm định tổng hợp (loại I và loại II, trong đó thiết bị kiểm tra phanh tổng hợp có chức năng kiểm tra xe dẫn động bốn bánh toàn thời gian) để kiểm định được cả xe con, xe bán tải (pickup), xe tải van, xe điện và xe tải, xe khách; dây chuyền thứ hai chỉ đầu tư khi lưu lượng thực tế của dây chuyền giai đoạn 1 đạt từ 90% công suất thiết kế (khoảng 13.480 lượt/năm trên công suất thiết kế 14.976 lượt/năm) trong 2 năm liên tiếp. Diện tích mặt bằng vẫn bảo đảm điều kiện cho 02 dây chuyền theo khoản 1 Điều 5 Nghị định số 89/2026/NĐ-CP (dự phòng trường hợp đầu tư phát triển, nâng cấp chuyển kiểm định). Tổng vốn đầu tư, vốn điều lệ, Bảng 15, 18, 19, 20 và thời gian hoàn vốn được tính lại tương ứng: Vốn đầu tư giai đoạn 1 là 20.456,5 triệu đồng (Trường góp 51% là 10.432,82 triệu đồng), nhân sự 11 người, thời gian hoàn vốn khoảng 8,5 năm.</w:t>
+              <w:t xml:space="preserve">đăng kiểm), đây là điểm khác biệt so với cơ sở đăng kiểm thuần thương mại. Bên cạnh đó, Trung tâm 82.01.S là đơn vị sự nghiệp công lập đang thực hiện thủ tục chuyển đổi (cổ phần hóa); từ ngày 30/9/2026, việc chuyển đổi thực hiện theo Nghị định số 373/2026/NĐ-CP. </w:t>
             </w:r>
           </w:p>
           <w:p>
@@ -1216,8 +1136,17 @@
             </w:pPr>
             <w:r>
               <w:rPr>
-                <w:color w:val="00B050"/>
+                <w:bCs/>
               </w:rPr>
+              <w:t>b) Tiếp thu điều chỉnh quy mô: Nhà trường cập nhật dự báo nhu cầu kiểm định có tính đến năng lực của Trung tâm 82.01.S và dự án An Phú Đăk Hà, và điều chỉnh quy mô theo hướng phân kỳ đầu tư: giai đoạn 1 đầu tư 01 dây chuyền kiểm định tổng hợp (loại I và loại II, trong đó thiết bị kiểm tra phanh tổng hợp có chức năng kiểm tra xe dẫn động bốn bánh toàn thời gian) để kiểm định được cả xe con, xe bán tải (pickup), xe tải van, xe điện và xe tải, xe khách; dây chuyền thứ hai chỉ đầu tư khi lưu lượng thực tế của dây chuyền giai đoạn 1 đạt từ 90% công suất thiết kế (khoảng 13.480 lượt/năm trên công suất thiết kế 14.976 lượt/năm) trong 2 năm liên tiếp. Diện tích mặt bằng vẫn bảo đảm điều kiện cho 02 dây chuyền theo khoản 1 Điều 5 Nghị định số 89/2026/NĐ-CP (dự phòng trường hợp đầu tư phát triển, nâng cấp chuyển kiểm định). Tổng vốn đầu tư, vốn điều lệ, Bảng 15, 18, 19, 20 và thời gian hoàn vốn được tính lại tương ứng: Vốn đầu tư giai đoạn 1 là 20.456,5 triệu đồng (Trường góp 51% là 10.432,82 triệu đồng), nhân sự 11 người, thời gian hoàn vốn khoảng 8,5 năm.</w:t>
+            </w:r>
+          </w:p>
+          <w:p>
+            <w:pPr>
+              <w:spacing w:after="40" w:line="240" w:lineRule="auto"/>
+              <w:jc w:val="both"/>
+            </w:pPr>
+            <w:r>
               <w:t>c) Điều chỉnh hồ sơ: Đề án (Mục I Phần I về sự cần thiết; Mục 2 Phần III về thiết bị; Phần IV về kinh phí, hiệu quả tài chính); Tờ trình (Mục quy mô, vốn); dự thảo Quyết định (quy mô, vốn điều lệ).</w:t>
             </w:r>
           </w:p>
@@ -1271,7 +1200,7 @@
         </w:tc>
         <w:tc>
           <w:tcPr>
-            <w:tcW w:w="9072" w:type="dxa"/>
+            <w:tcW w:w="9356" w:type="dxa"/>
             <w:tcBorders>
               <w:top w:val="single" w:sz="4" w:space="0" w:color="000000"/>
               <w:left w:val="single" w:sz="4" w:space="0" w:color="000000"/>
@@ -1298,21 +1227,9 @@
               <w:jc w:val="both"/>
             </w:pPr>
             <w:r>
-              <w:rPr>
-                <w:color w:val="00B050"/>
-              </w:rPr>
-              <w:t xml:space="preserve">a) Bỏ nguồn Quỹ phát triển hoạt động sự nghiệp khỏi cơ cấu nguồn vốn góp tại Bảng 5 Đề án. </w:t>
-            </w:r>
-            <w:r>
-              <w:rPr>
-                <w:color w:val="00B050"/>
-              </w:rPr>
-              <w:t>Phần vốn góp của Trường được xác định cụ thể theo từng nguồn</w:t>
-            </w:r>
-            <w:r>
-              <w:rPr>
-                <w:color w:val="00B050"/>
-              </w:rPr>
+              <w:t>a) Bỏ nguồn Quỹ phát triển hoạt động sự nghiệp khỏi cơ cấu nguồn vốn góp tại Bảng 5 Đề án. Phần vốn góp của Trường được xác định cụ thể theo từng nguồn</w:t>
+            </w:r>
+            <w:r>
               <w:t xml:space="preserve"> vốn góp trong Đề án.</w:t>
             </w:r>
           </w:p>
@@ -1322,9 +1239,6 @@
               <w:jc w:val="both"/>
             </w:pPr>
             <w:r>
-              <w:rPr>
-                <w:color w:val="00B050"/>
-              </w:rPr>
               <w:t>b) Đối với vốn vay của tổ chức tín dụng: Nhà trường tiếp thu ý kiến, chỉ sử dụng nguồn vốn vay để góp vốn khi được cơ quan có thẩm quyền hướng dẫn, chấp thuận; nội dung này đưa vào văn bản xin ý kiến Bộ Tài chính nêu tại mục 1.1. Do cơ sở giáo dục nghề nghiệp công lập không có Hội đồng trường (điểm b khoản 1 Điều 11 Luật Giáo dục nghề nghiệp), phương án vay vốn, huy động vốn và hoàn trả vốn của Trường được báo cáo cơ quan quản lý cấp trên cho ý kiến về chủ trương theo khoản 4 Điều 24 Nghị định số 60/2021/NĐ-CP (được sửa đổi tại khoản 16 Điều 1 Nghị định số 111/2025/NĐ-CP); nhà trường bổ sung bước này vào Giai đoạn 2 Bảng 17 Đề án.</w:t>
             </w:r>
           </w:p>
@@ -1337,14 +1251,10 @@
               <w:rPr>
                 <w:b/>
                 <w:bCs/>
-                <w:color w:val="00B050"/>
               </w:rPr>
               <w:t>Về nguồn vay:</w:t>
             </w:r>
             <w:r>
-              <w:rPr>
-                <w:color w:val="00B050"/>
-              </w:rPr>
               <w:t xml:space="preserve"> Theo điểm b khoản 6 Điều 7 Nghị định số 334/2026/NĐ-CP, dự án đầu tư xây dựng xưởng thực hành phục vụ nâng cao chất lượng giáo dục được ưu tiên xem xét cho vay, áp dụng lãi suất ưu đãi từ Quỹ Đầu tư phát triển địa phương khi đáp ứng điều kiện cho vay. Nhà trường nghiên cứu phương án thiết kế dây chuyền kiểm định kết hợp chức năng xưởng thực hành nghề Công nghệ ô tô để tiếp cận nguồn vốn này; mọi khoản vay phải có phương án trả nợ, không phát sinh nghĩa vụ nợ của ngân sách nhà nước (điểm d khoản 5 Điều 7 Nghị định số 334/2026/NĐ-CP).</w:t>
             </w:r>
           </w:p>
@@ -1354,21 +1264,12 @@
               <w:jc w:val="both"/>
             </w:pPr>
             <w:r>
-              <w:rPr>
-                <w:color w:val="00B050"/>
-              </w:rPr>
               <w:t xml:space="preserve">c) Giảm nhu cầu vốn góp của Trường thông qua phân kỳ đầu tư tại mục 1.2; nghiên cứu phương án điều chỉnh tỷ lệ góp vốn, trong đó Trường giữ tỷ lệ </w:t>
             </w:r>
             <w:r>
-              <w:rPr>
-                <w:color w:val="00B050"/>
-              </w:rPr>
               <w:t>51</w:t>
             </w:r>
             <w:r>
-              <w:rPr>
-                <w:color w:val="00B050"/>
-              </w:rPr>
               <w:t>% (trường hợp giữ quyền chi phối thì không thấp hơn 51%).</w:t>
             </w:r>
           </w:p>
@@ -1378,9 +1279,6 @@
               <w:jc w:val="both"/>
             </w:pPr>
             <w:r>
-              <w:rPr>
-                <w:color w:val="00B050"/>
-              </w:rPr>
               <w:t>d) Bổ sung phương án dự phòng để cấp có thẩm quyền lựa chọn: Trường liên doanh, liên kết không hình thành pháp nhân mới theo điểm a, b khoản 4 Điều 55 Nghị định số 186/2025/NĐ-CP, trong đó Trường sử dụng mặt bằng và tài sản sẵn có, nhà đầu tư đầu tư nhà xưởng, dây chuyền, thiết bị; Trung tâm là đơn vị trực thuộc Trường do Hiệu trưởng quyết định thành lập theo điểm a khoản 1 Điều 6 Nghị định số 334/2026/NĐ-CP, hạch toán độc lập, tự chủ kinh phí (mô hình đã có tiền lệ tại Trung tâm Đăng kiểm xe cơ giới 50-08D thuộc Trường Cao đẳng Giao thông vận tải Trung ương III). Phương án này không phát sinh nhu cầu vốn góp bằng tiền của Trường.</w:t>
             </w:r>
           </w:p>
@@ -1390,9 +1288,6 @@
               <w:jc w:val="both"/>
             </w:pPr>
             <w:r>
-              <w:rPr>
-                <w:color w:val="00B050"/>
-              </w:rPr>
               <w:t>đ) Điều chỉnh hồ sơ: Đề án (Bảng 5, 18, 20, 21; mục quản lý phần vốn); Tờ trình (Mục III.1a, 4.1a, thống nhất cách ghi “góp vốn bằng tiền”); dự thảo Quyết định (cơ cấu vốn, nguồn vốn).</w:t>
             </w:r>
           </w:p>
@@ -1434,7 +1329,7 @@
         </w:tc>
         <w:tc>
           <w:tcPr>
-            <w:tcW w:w="13041" w:type="dxa"/>
+            <w:tcW w:w="13325" w:type="dxa"/>
             <w:gridSpan w:val="2"/>
             <w:tcBorders>
               <w:top w:val="single" w:sz="4" w:space="0" w:color="000000"/>
@@ -1512,7 +1407,7 @@
         </w:tc>
         <w:tc>
           <w:tcPr>
-            <w:tcW w:w="9072" w:type="dxa"/>
+            <w:tcW w:w="9356" w:type="dxa"/>
             <w:tcBorders>
               <w:top w:val="single" w:sz="4" w:space="0" w:color="000000"/>
               <w:left w:val="single" w:sz="4" w:space="0" w:color="000000"/>
@@ -1548,9 +1443,6 @@
               <w:jc w:val="both"/>
             </w:pPr>
             <w:r>
-              <w:rPr>
-                <w:color w:val="00B050"/>
-              </w:rPr>
               <w:t>b) Về việc sử dụng khu đất: Đề án không góp vốn bằng quyền sử dụng đất (đã tiếp thu theo ý kiến Sở Nông nghiệp và Môi trường tại Báo cáo số 382/BC-CĐKT ngày 25/8/2026). Nhà trường tiếp thu, làm rõ trong Đề án hình thức pháp lý để Công ty sử dụng mặt bằng (cho thuê tài sản công theo Điều 57 Luật Quản lý, sử dụng tài sản công hoặc sử dụng tài sản gắn liền với đất vào liên doanh, liên kết theo Điều 58 Luật Quản lý, sử dụng tài sản công và điểm d khoản 4 Điều 51 Nghị định số 186/2025/NĐ-CP), kèm thời hạn, giá, nghĩa vụ tài chính và phương án xử lý tài sản khi chấm dứt hợp tác. Việc sử dụng đất chỉ thực hiện sau khi Đề án sử dụng tài sản công được Hiệu trưởng phê duyệt theo điểm a khoản 7 Điều 7 Nghị định số 334/2026/NĐ-CP, khoản 2 Điều 14 Quy định ban hành kèm theo Quyết định số 46/2025/QĐ-CTUBND và báo cáo Ủy ban nhân dân tỉnh (Giai đoạn 2 Bảng 17 Đề án). Đồng thời, việc xác định diện tích khu đất thuộc trường hợp “chưa sử dụng hết công suất” theo khoản 1 Điều 58 Luật Quản lý, sử dụng tài sản công được rà soát theo tiêu chuẩn, định mức cơ sở hoạt động sự nghiệp tại Nghị định số 155/2025/NĐ-CP được sửa đổi, bổ sung bởi Nghị định số 369/2026/NĐ-CP ngày 25/9/2026 của Chính phủ (có hiệu lực từ ngày 11/11/2026).</w:t>
             </w:r>
           </w:p>
@@ -1563,14 +1455,10 @@
               <w:rPr>
                 <w:b/>
                 <w:bCs/>
-                <w:color w:val="00B050"/>
               </w:rPr>
               <w:t>c) Điều chỉnh hồ sơ:</w:t>
             </w:r>
             <w:r>
-              <w:rPr>
-                <w:color w:val="00B050"/>
-              </w:rPr>
               <w:t xml:space="preserve"> Đề án (Mục 2, 3, 4 Phần III; xử lý dòng quyền sử dụng đất tại Bảng 12 để thống nhất với nội dung không góp vốn bằng đất); Tờ trình, dự thảo Quyết định (bổ sung nội dung giao Trường lập Đề án sử dụng tài sản công).</w:t>
             </w:r>
           </w:p>
@@ -1624,7 +1512,7 @@
         </w:tc>
         <w:tc>
           <w:tcPr>
-            <w:tcW w:w="9072" w:type="dxa"/>
+            <w:tcW w:w="9356" w:type="dxa"/>
             <w:tcBorders>
               <w:top w:val="single" w:sz="4" w:space="0" w:color="000000"/>
               <w:left w:val="single" w:sz="4" w:space="0" w:color="000000"/>
@@ -1663,21 +1551,12 @@
               <w:jc w:val="both"/>
             </w:pPr>
             <w:r>
-              <w:rPr>
-                <w:color w:val="00B050"/>
-              </w:rPr>
               <w:t xml:space="preserve">Tiếp thu tinh thần thận trọng của ý kiến, nhà trường bổ sung vào Đề án: </w:t>
             </w:r>
             <w:r>
-              <w:rPr>
-                <w:color w:val="00B050"/>
-              </w:rPr>
               <w:t xml:space="preserve">Cơ </w:t>
             </w:r>
             <w:r>
-              <w:rPr>
-                <w:color w:val="00B050"/>
-              </w:rPr>
               <w:t>chế giám sát phần vốn (kiểm toán độc lập hằng năm, báo cáo định kỳ), ngưỡng cảnh báo hiệu quả và lộ trình thoái vốn, thu hồi vốn khi Công ty thua lỗ (hoàn thiện mục quản lý phần vốn tại Phần IV Đề án); đồng thời trình bày phương án dự phòng không hình thành pháp nhân mới tại điểm d mục 1.3 Báo cáo này.</w:t>
             </w:r>
           </w:p>
@@ -1731,7 +1610,7 @@
         </w:tc>
         <w:tc>
           <w:tcPr>
-            <w:tcW w:w="9072" w:type="dxa"/>
+            <w:tcW w:w="9356" w:type="dxa"/>
             <w:tcBorders>
               <w:top w:val="single" w:sz="4" w:space="0" w:color="000000"/>
               <w:left w:val="single" w:sz="4" w:space="0" w:color="000000"/>
@@ -1749,21 +1628,11 @@
               <w:rPr>
                 <w:b/>
                 <w:bCs/>
-                <w:color w:val="00B050"/>
               </w:rPr>
               <w:t xml:space="preserve">Tiếp thu ý kiến. </w:t>
             </w:r>
             <w:r>
-              <w:rPr>
-                <w:color w:val="00B050"/>
-              </w:rPr>
-              <w:t xml:space="preserve">Nhà trường thống nhất và kiến nghị Ủy ban nhân dân tỉnh (qua Sở Tài chính) xin ý kiến Bộ Tài chính (về cơ chế góp vốn, quản lý phần vốn, sử dụng vốn vay) và Bộ Nội vụ (về nhân sự là viên chức tham gia quản lý Công ty). </w:t>
-            </w:r>
-            <w:r>
-              <w:rPr>
-                <w:color w:val="00B050"/>
-              </w:rPr>
-              <w:t>Nhà trường dự thảo nội dung xin ý kiến gửi kèm Báo cáo này.</w:t>
+              <w:t>Nhà trường thống nhất và kiến nghị Ủy ban nhân dân tỉnh (qua Sở Tài chính) xin ý kiến Bộ Tài chính (về cơ chế góp vốn, quản lý phần vốn, sử dụng vốn vay) và Bộ Nội vụ (về nhân sự là viên chức tham gia quản lý Công ty). Nhà trường dự thảo nội dung xin ý kiến gửi kèm Báo cáo này.</w:t>
             </w:r>
           </w:p>
         </w:tc>
@@ -1804,7 +1673,7 @@
         </w:tc>
         <w:tc>
           <w:tcPr>
-            <w:tcW w:w="13041" w:type="dxa"/>
+            <w:tcW w:w="13325" w:type="dxa"/>
             <w:gridSpan w:val="2"/>
             <w:tcBorders>
               <w:top w:val="single" w:sz="4" w:space="0" w:color="000000"/>
@@ -1882,7 +1751,7 @@
         </w:tc>
         <w:tc>
           <w:tcPr>
-            <w:tcW w:w="9072" w:type="dxa"/>
+            <w:tcW w:w="9356" w:type="dxa"/>
             <w:tcBorders>
               <w:top w:val="single" w:sz="4" w:space="0" w:color="000000"/>
               <w:left w:val="single" w:sz="4" w:space="0" w:color="000000"/>
@@ -1953,7 +1822,7 @@
         </w:tc>
         <w:tc>
           <w:tcPr>
-            <w:tcW w:w="9072" w:type="dxa"/>
+            <w:tcW w:w="9356" w:type="dxa"/>
             <w:tcBorders>
               <w:top w:val="single" w:sz="4" w:space="0" w:color="000000"/>
               <w:left w:val="single" w:sz="4" w:space="0" w:color="000000"/>
@@ -1973,26 +1842,16 @@
                 <w:bCs/>
                 <w:i/>
                 <w:iCs/>
-                <w:color w:val="00B050"/>
               </w:rPr>
               <w:t>Tiếp thu ý kiến.</w:t>
             </w:r>
             <w:r>
-              <w:rPr>
-                <w:color w:val="00B050"/>
-              </w:rPr>
               <w:t xml:space="preserve"> Đề án đã bỏ hình thức biệt phái, điều động viên chức sang Công ty (Báo cáo số 382/BC-CĐKT ngày 25/8/2026). Theo khoản 4 Điều 4 Nghị định số 181/2026/NĐ-CP, người đại diện phần vốn nhà nước, kiểm soát viên không là cán bộ, công chức, viên chức; việc bố trí người có nguồn gốc từ viên chức của Trường chỉ thực hiện sau khi có hướng dẫn của Bộ Nội vụ (kiêm nhiệm hay chấm dứt quan hệ viên chức) và quyết định của cấp có thẩm quyền. Nhà trường bổ sung vào Mục IV Phần II Đề án nguyên tắc: </w:t>
             </w:r>
             <w:r>
-              <w:rPr>
-                <w:color w:val="00B050"/>
-              </w:rPr>
               <w:t xml:space="preserve">Viên </w:t>
             </w:r>
             <w:r>
-              <w:rPr>
-                <w:color w:val="00B050"/>
-              </w:rPr>
               <w:t>chức tham gia không làm ảnh hưởng đến nhiệm vụ được giao tại Trường; chế độ tiền lương, thù lao thực hiện theo pháp luật về viên chức và quản lý vốn nhà nước tại doanh nghiệp. Việc cử viên chức là đảng viên tham gia quản lý, làm đại diện phần vốn, tài sản của Trường tại Công ty thực hiện theo điểm b khoản 3 Điều 8 và Điều 12 (kiểm soát xung đột lợi ích) Quy định số 224-QĐ/TW ngày 14/10/2026; người được cử không được đầu tư kinh doanh cá nhân trong lĩnh vực đăng kiểm có lợi ích liên quan trực tiếp đến Công ty. Nhà trường bổ sung nội dung này vào Mục IV Phần II Đề án.</w:t>
             </w:r>
           </w:p>
@@ -2034,7 +1893,7 @@
         </w:tc>
         <w:tc>
           <w:tcPr>
-            <w:tcW w:w="13041" w:type="dxa"/>
+            <w:tcW w:w="13325" w:type="dxa"/>
             <w:gridSpan w:val="2"/>
             <w:tcBorders>
               <w:top w:val="single" w:sz="4" w:space="0" w:color="000000"/>
@@ -2112,7 +1971,7 @@
         </w:tc>
         <w:tc>
           <w:tcPr>
-            <w:tcW w:w="9072" w:type="dxa"/>
+            <w:tcW w:w="9356" w:type="dxa"/>
             <w:tcBorders>
               <w:top w:val="single" w:sz="4" w:space="0" w:color="000000"/>
               <w:left w:val="single" w:sz="4" w:space="0" w:color="000000"/>
@@ -2180,7 +2039,7 @@
         </w:tc>
         <w:tc>
           <w:tcPr>
-            <w:tcW w:w="9072" w:type="dxa"/>
+            <w:tcW w:w="9356" w:type="dxa"/>
             <w:tcBorders>
               <w:top w:val="single" w:sz="4" w:space="0" w:color="000000"/>
               <w:left w:val="single" w:sz="4" w:space="0" w:color="000000"/>
@@ -2248,7 +2107,7 @@
         </w:tc>
         <w:tc>
           <w:tcPr>
-            <w:tcW w:w="9072" w:type="dxa"/>
+            <w:tcW w:w="9356" w:type="dxa"/>
             <w:tcBorders>
               <w:top w:val="single" w:sz="4" w:space="0" w:color="000000"/>
               <w:left w:val="single" w:sz="4" w:space="0" w:color="000000"/>
@@ -2266,39 +2125,17 @@
               <w:rPr>
                 <w:b/>
                 <w:bCs/>
-                <w:color w:val="00B050"/>
               </w:rPr>
               <w:t>Tiếp thu ý kiến.</w:t>
             </w:r>
             <w:r>
-              <w:rPr>
-                <w:color w:val="00B050"/>
-              </w:rPr>
-              <w:t xml:space="preserve"> Nhà trường bổ sung bước “Vận hành thử toàn bộ hệ thống kiểm định tối thiểu 01 tháng” vào Giai đoạn 7 Bảng 17 Đề án, trước bước đề nghị cấp giấy chứng nhận; bổ sung bước lựa chọn tổ chức đánh giá sự phù hợp hoặc đề nghị Ủy ban nhân dân tỉnh kiểm tra xác nhận theo khoản 5 Điều 23 Nghị định số 89/2026/NĐ-CP. </w:t>
-            </w:r>
-            <w:r>
-              <w:rPr>
-                <w:color w:val="00B050"/>
-              </w:rPr>
-              <w:t xml:space="preserve">Mốc dự kiến đưa Trung tâm vào hoạt động điều chỉnh tương ứng </w:t>
-            </w:r>
-            <w:r>
-              <w:rPr>
-                <w:color w:val="00B050"/>
-              </w:rPr>
+              <w:t xml:space="preserve"> Nhà trường bổ sung bước “Vận hành thử toàn bộ hệ thống kiểm định tối thiểu 01 tháng” vào Giai đoạn 7 Bảng 17 Đề án, trước bước đề nghị cấp giấy chứng nhận; bổ sung bước lựa chọn tổ chức đánh giá sự phù hợp hoặc đề nghị Ủy ban nhân dân tỉnh kiểm tra xác nhận theo khoản 5 Điều 23 Nghị định số 89/2026/NĐ-CP. Mốc dự kiến đưa Trung tâm vào hoạt động điều chỉnh tương ứng </w:t>
+            </w:r>
+            <w:r>
               <w:t>trong Đề án</w:t>
             </w:r>
             <w:r>
-              <w:rPr>
-                <w:color w:val="00B050"/>
-              </w:rPr>
-              <w:t>.</w:t>
-            </w:r>
-            <w:r>
-              <w:rPr>
-                <w:color w:val="00B050"/>
-              </w:rPr>
-              <w:t xml:space="preserve"> Đồng thời sửa lỗi đánh số trùng mục “4.2” tại lộ trình. Điều chỉnh đồng bộ lộ trình trong Tờ trình. Trình tự, hồ sơ cấp giấy chứng nhận đủ điều kiện hoạt động kiểm định thực hiện theo Thông tư số 46/2024/TT-BGTVT ngày 15/11/2024 của Bộ trưởng Bộ Giao thông vận tải, được sửa đổi, bổ sung bởi Thông tư số 71/2025/TT-BXD, Thông tư số 24/2026/TT-BXD và Thông tư số 45/2026/TT-BXD ngày 30/6/2026 của Bộ trưởng Bộ Xây dựng (hợp nhất tại Văn bản hợp nhất số 68/VBHN-BXD ngày 09/9/2026); trong đó, theo Điều 16a, trước khi đề nghị cấp giấy chứng nhận, tổ chức thành lập cơ sở đăng kiểm đề nghị Cục Đăng kiểm Việt Nam cấp quyền khai thác thử nghiệm phần mềm quản lý kiểm định, phần mềm thu phí sử dụng đường bộ và thông báo cho Sở Xây dựng, Cục Đăng kiểm Việt Nam thời gian vận hành thử. Nhà trường bổ sung các bước này vào Giai đoạn 7 Bảng 17 Đề án.</w:t>
+              <w:t>. Đồng thời sửa lỗi đánh số trùng mục “4.2” tại lộ trình. Điều chỉnh đồng bộ lộ trình trong Tờ trình. Trình tự, hồ sơ cấp giấy chứng nhận đủ điều kiện hoạt động kiểm định thực hiện theo Thông tư số 46/2024/TT-BGTVT ngày 15/11/2024 của Bộ trưởng Bộ Giao thông vận tải, được sửa đổi, bổ sung bởi Thông tư số 71/2025/TT-BXD, Thông tư số 24/2026/TT-BXD và Thông tư số 45/2026/TT-BXD ngày 30/6/2026 của Bộ trưởng Bộ Xây dựng (hợp nhất tại Văn bản hợp nhất số 68/VBHN-BXD ngày 09/9/2026); trong đó, theo Điều 16a, trước khi đề nghị cấp giấy chứng nhận, tổ chức thành lập cơ sở đăng kiểm đề nghị Cục Đăng kiểm Việt Nam cấp quyền khai thác thử nghiệm phần mềm quản lý kiểm định, phần mềm thu phí sử dụng đường bộ và thông báo cho Sở Xây dựng, Cục Đăng kiểm Việt Nam thời gian vận hành thử. Nhà trường bổ sung các bước này vào Giai đoạn 7 Bảng 17 Đề án.</w:t>
             </w:r>
           </w:p>
         </w:tc>
@@ -2352,7 +2189,7 @@
         </w:tc>
         <w:tc>
           <w:tcPr>
-            <w:tcW w:w="9072" w:type="dxa"/>
+            <w:tcW w:w="9356" w:type="dxa"/>
             <w:tcBorders>
               <w:top w:val="single" w:sz="4" w:space="0" w:color="000000"/>
               <w:left w:val="single" w:sz="4" w:space="0" w:color="000000"/>
@@ -2367,45 +2204,24 @@
               <w:jc w:val="both"/>
             </w:pPr>
             <w:r>
-              <w:rPr>
-                <w:color w:val="00B050"/>
-              </w:rPr>
               <w:t xml:space="preserve">Tiếp thu ý kiến. Nhà trường bổ sung vào Mục 2 Phần III và Phụ lục IV Đề án nguyên tắc: </w:t>
             </w:r>
             <w:r>
-              <w:rPr>
-                <w:color w:val="00B050"/>
-              </w:rPr>
               <w:t xml:space="preserve">Danh </w:t>
             </w:r>
             <w:r>
-              <w:rPr>
-                <w:color w:val="00B050"/>
-              </w:rPr>
               <w:t xml:space="preserve">mục thiết bị, thiết kế xưởng kiểm định được rà soát theo quy chuẩn kỹ thuật quốc gia có hiệu lực tại thời điểm lập dự án đầu tư (Giai đoạn 6); dự phòng chi phí cho điều chỉnh do thay đổi quy chuẩn. Việc lựa chọn nhà thầu xây lắp, mua sắm dây chuyền, thiết bị của Công ty thực hiện theo pháp luật về đấu thầu (Nghị định số 214/2025/NĐ-CP được sửa đổi, bổ sung bởi Nghị định số 165/2026/NĐ-CP, Nghị định số 170/2026/NĐ-CP và Nghị định số 349/2026/NĐ-CP), bảo đảm công khai, cạnh tranh, hiệu quả; nội dung này bổ sung vào Giai đoạn 6 Bảng 17 Đề án. Qua rà soát, QCVN 103:2024/BGTVT ban hành kèm theo Thông tư số 50/2024/TT-BGTVT ngày 15/11/2024 của Bộ trưởng Bộ Giao thông vận tải hiện vẫn còn hiệu lực; Bộ Xây dựng đang lấy ý kiến dự thảo QCVN thay thế, dự kiến có hiệu lực từ ngày 01/01/2027, trước thời điểm Trung tâm đầu tư (từ Quý II năm 2027). Trung tâm là cơ sở xây mới, không thuộc diện áp dụng điều khoản chuyển tiếp, nên nhà trường điều chỉnh Đề án theo dự thảo như sau: (i) Mặt bằng, xưởng kiểm định, đường nội bộ: </w:t>
             </w:r>
             <w:r>
-              <w:rPr>
-                <w:color w:val="00B050"/>
-              </w:rPr>
               <w:t xml:space="preserve">Yêu </w:t>
             </w:r>
             <w:r>
-              <w:rPr>
-                <w:color w:val="00B050"/>
-              </w:rPr>
               <w:t>cầu của dự thảo không thay đổi so với QCVN 103:2024/BGTVT; Đề án đáp ứng (xưởng 740 m², kích thước thông xe dây chuyền loại II tối thiểu 36 x 5 x 4,5 m; đường nội bộ rộng 6 m, quy định tối thiểu 3,0 m; khu vực xe chờ tách biệt khu vực kiểm tra); bổ sung hố móng và vùng mặt sàn có độ phẳng ± 6 mm trong phạm vi 10 m phía trước, phía sau thiết bị cân cụm trục; thống nhất diện tích xưởng giữa Bảng 14 (740 m²) và Bảng 18 (700 m²); (ii) Dây chuyền, thiết bị: bổ sung thiết bị cân kiểm tra khối lượng xe cơ giới gồm cân trục đơn (dải đo 0 – 5.000 kg, kích thước 3,0 x 0,8 m) và cân cụm trục (dải đo 0 – 30.000 kg, kích thước 3,0 x 3,0 m), cấp chính xác III; trang bị ít nhất 01 thiết bị kiểm tra phanh tổng hợp (loại I và loại II) có chức năng kiểm tra xe dẫn động bốn bánh toàn thời gian (con lăn quay trơn có khóa hãm hoặc thiết bị đo lực bàn đạp phanh) để kiểm định xe con, xe bán tải, xe tải van, xe điện có khối lượng toàn bộ đến 3,5 tấn; dụng cụ đo độ truyền sáng kính chắn gió (dải đo 0 – 100%, sai số ± 2%, kết nối máy tính); dụng cụ, trang bị bảo vệ an toàn cách điện cho đăng kiểm viên khi kiểm tra xe điện, xe hybrid điện; thiết bị kiểm tra đèn chiếu sáng phía trước xác định được hình dạng chùm sáng và định vị buồng đo song song, vuông góc với phương tiện; phần mềm điều khiển thiết bị mã hóa, lưu trữ dữ liệu tối thiểu 36 tháng; camera giám sát khu vực tiếp nhận hồ sơ; (iii) Kiểm định khí thải xe mô tô, xe gắn máy: khu vực chờ tách biệt khu vực kiểm định; thiết bị phân tích khí thải đo CO, CO2, HC, O2, lamda theo Bảng 8 của dự thảo; camera AI (01 camera khu vực kiểm định, 02 camera và 01 camera nhận diện khuôn mặt đăng kiểm viên cho mỗi thiết bị), kết nối Sở Xây dựng và Cục Đăng kiểm Việt Nam; (iv) Hệ thống quản lý chất lượng theo nguyên tắc TCVN ISO/IEC 17020:2012 và chứng nhận phù hợp quy chuẩn do tổ chức đánh giá sự phù hợp được chỉ định thực hiện trước khi đưa vào hoạt động. Các yêu cầu tại các điểm (i), (ii), (iii) và (iv) nêu trên được tính đủ vào khoản dự phòng đầu tư chuẩn hóa theo quy chuẩn mới khoảng 2.980 triệu đồng; nhà trường cập nhật Bảng 15 (giai đoạn 1 đầu tư 01 dây chuyền kiểm định tổng hợp loại I và loại II, có thiết bị kiểm tra phanh tổng hợp kiểm tra được xe dẫn động bốn bánh toàn thời gian), Bảng 18 và Phụ lục IV Đề án (ước tính trên cơ sở giá tham khảo, sẽ chuẩn xác bằng báo giá khi lập dự án đầu tư</w:t>
             </w:r>
             <w:r>
-              <w:rPr>
-                <w:color w:val="00B050"/>
-              </w:rPr>
               <w:t xml:space="preserve"> và Quy chuẩn mới được ban hành</w:t>
             </w:r>
             <w:r>
-              <w:rPr>
-                <w:color w:val="00B050"/>
-              </w:rPr>
               <w:t>).</w:t>
             </w:r>
           </w:p>
@@ -2448,7 +2264,7 @@
         </w:tc>
         <w:tc>
           <w:tcPr>
-            <w:tcW w:w="13041" w:type="dxa"/>
+            <w:tcW w:w="13325" w:type="dxa"/>
             <w:gridSpan w:val="2"/>
             <w:tcBorders>
               <w:top w:val="single" w:sz="4" w:space="0" w:color="000000"/>
@@ -2526,7 +2342,7 @@
         </w:tc>
         <w:tc>
           <w:tcPr>
-            <w:tcW w:w="9072" w:type="dxa"/>
+            <w:tcW w:w="9356" w:type="dxa"/>
             <w:tcBorders>
               <w:top w:val="single" w:sz="4" w:space="0" w:color="000000"/>
               <w:left w:val="single" w:sz="4" w:space="0" w:color="000000"/>
@@ -2541,9 +2357,6 @@
               <w:jc w:val="both"/>
             </w:pPr>
             <w:r>
-              <w:rPr>
-                <w:color w:val="00B050"/>
-              </w:rPr>
               <w:t>Ghi nhận ý kiến. Sở Xây dựng đã có ý kiến khu đất dự kiến phù hợp quy hoạch chung đô thị (Công văn số 7173/SXD-VTPT ngày 11/9/2026). Nhà trường sẽ phối hợp Sở Xây dựng xác định việc có phải điều chỉnh quy hoạch cục bộ hay không khi lập dự án đầu tư; trường hợp phải điều chỉnh, bổ sung thủ tục này vào Giai đoạn 6 Bảng 17 Đề án.</w:t>
             </w:r>
           </w:p>
@@ -2597,7 +2410,7 @@
         </w:tc>
         <w:tc>
           <w:tcPr>
-            <w:tcW w:w="9072" w:type="dxa"/>
+            <w:tcW w:w="9356" w:type="dxa"/>
             <w:tcBorders>
               <w:top w:val="single" w:sz="4" w:space="0" w:color="000000"/>
               <w:left w:val="single" w:sz="4" w:space="0" w:color="000000"/>
@@ -2615,39 +2428,14 @@
               <w:rPr>
                 <w:b/>
                 <w:bCs/>
-                <w:color w:val="00B050"/>
               </w:rPr>
               <w:t>Tiếp thu ý kiến.</w:t>
             </w:r>
             <w:r>
-              <w:rPr>
-                <w:color w:val="00B050"/>
-              </w:rPr>
               <w:t xml:space="preserve"> Nhà trường phối hợp Ủy ban nhân dân phường Đăk Cấm xác nhận khu đất trong chỉ tiêu sử dụng đất được phân bổ cho phường theo Quyết định số 788/QĐ-UBND ngày 27/02/2026; bổ sung kết quả vào Mục 2 Phần III Đề án. </w:t>
             </w:r>
             <w:r>
-              <w:rPr>
-                <w:color w:val="00B050"/>
-              </w:rPr>
-              <w:t xml:space="preserve">Hiện nay, vị trí khu đất dự kiến đặt Trung tâm thuộc </w:t>
-            </w:r>
-            <w:r>
-              <w:rPr>
-                <w:color w:val="00B050"/>
-              </w:rPr>
-              <w:t>quy hoạch đất dịch vụ - công cộng khác cấp đô thị</w:t>
-            </w:r>
-            <w:r>
-              <w:rPr>
-                <w:color w:val="00B050"/>
-              </w:rPr>
-              <w:t xml:space="preserve">, bảo đảm phù hợp với </w:t>
-            </w:r>
-            <w:r>
-              <w:rPr>
-                <w:color w:val="00B050"/>
-              </w:rPr>
-              <w:t>quy hoạch tỉnh và chỉ tiêu sử dụng đất của phường.</w:t>
+              <w:t>Hiện nay, vị trí khu đất dự kiến đặt Trung tâm thuộc quy hoạch đất dịch vụ - công cộng khác cấp đô thị, bảo đảm phù hợp với quy hoạch tỉnh và chỉ tiêu sử dụng đất của phường.</w:t>
             </w:r>
           </w:p>
         </w:tc>
@@ -2700,7 +2488,7 @@
         </w:tc>
         <w:tc>
           <w:tcPr>
-            <w:tcW w:w="9072" w:type="dxa"/>
+            <w:tcW w:w="9356" w:type="dxa"/>
             <w:tcBorders>
               <w:top w:val="single" w:sz="4" w:space="0" w:color="000000"/>
               <w:left w:val="single" w:sz="4" w:space="0" w:color="000000"/>
@@ -2720,14 +2508,10 @@
                 <w:bCs/>
                 <w:i/>
                 <w:iCs/>
-                <w:color w:val="00B050"/>
               </w:rPr>
               <w:t>Tiếp thu ý kiến.</w:t>
             </w:r>
             <w:r>
-              <w:rPr>
-                <w:color w:val="00B050"/>
-              </w:rPr>
               <w:t xml:space="preserve"> Nhà trường bổ sung bước lập hồ sơ thủ tục môi trường vào Giai đoạn 6 Bảng 17 Đề án (sau khi chấp thuận chủ trương đầu tư); các nội dung tại Công văn số 10002/STNMT-TCCB đã được tiếp thu, giải trình tại Báo cáo số 382/BC-CĐKT ngày 25/8/2026.</w:t>
             </w:r>
           </w:p>
@@ -2769,7 +2553,7 @@
         </w:tc>
         <w:tc>
           <w:tcPr>
-            <w:tcW w:w="13041" w:type="dxa"/>
+            <w:tcW w:w="13325" w:type="dxa"/>
             <w:gridSpan w:val="2"/>
             <w:tcBorders>
               <w:top w:val="single" w:sz="4" w:space="0" w:color="000000"/>
@@ -2847,7 +2631,7 @@
         </w:tc>
         <w:tc>
           <w:tcPr>
-            <w:tcW w:w="9072" w:type="dxa"/>
+            <w:tcW w:w="9356" w:type="dxa"/>
             <w:tcBorders>
               <w:top w:val="single" w:sz="4" w:space="0" w:color="000000"/>
               <w:left w:val="single" w:sz="4" w:space="0" w:color="000000"/>
@@ -2867,14 +2651,10 @@
                 <w:bCs/>
                 <w:i/>
                 <w:iCs/>
-                <w:color w:val="00B050"/>
               </w:rPr>
               <w:t>Tiếp thu ý kiến.</w:t>
             </w:r>
             <w:r>
-              <w:rPr>
-                <w:color w:val="00B050"/>
-              </w:rPr>
               <w:t xml:space="preserve"> Đề án đã tính thuế thu nhập doanh nghiệp tại Bảng 20; thuế giá trị gia tăng kê khai, nộp theo phương pháp khấu trừ, không làm giảm doanh thu, lợi nhuận của Công ty. Nhà trường bổ sung vào mục cơ chế tài chính của Công ty: nghĩa vụ khấu trừ thuế thu nhập cá nhân; thu, nộp lệ phí cấp giấy chứng nhận kiểm định và phí sử dụng đường bộ; rà soát lại căn cứ miễn thuế thu nhập doanh nghiệp 03 năm đầu và thuế suất áp dụng sau thời gian miễn (Nghị định số 20/2026/NĐ-CP) ; theo đó, thời gian miễn thuế 03 năm tính từ năm được cấp Giấy chứng nhận đăng ký doanh nghiệp lần đầu, thuế suất 17% áp dụng theo khoản 3 Điều 10 Luật Thuế thu nhập doanh nghiệp đối với doanh nghiệp có doanh thu năm từ trên 03 tỷ đồng đến không quá 50 tỷ đồng; phương án tài chính tạm tính thuế suất 20% để thận trọng. Giá dịch vụ kiểm định chưa bao gồm thuế giá trị gia tăng theo khoản 2 Điều 3 Thông tư số 40/2025/TT-BXD.</w:t>
             </w:r>
           </w:p>
@@ -2883,7 +2663,7 @@
     </w:tbl>
     <w:p>
       <w:pPr>
-        <w:spacing w:after="240"/>
+        <w:spacing w:before="240" w:after="240"/>
         <w:ind w:firstLine="720"/>
         <w:jc w:val="both"/>
       </w:pPr>
@@ -3109,16 +2889,6 @@
         </w:tc>
       </w:tr>
     </w:tbl>
-    <w:p>
-      <w:pPr>
-        <w:spacing w:after="120"/>
-        <w:ind w:firstLine="720"/>
-        <w:jc w:val="both"/>
-        <w:rPr>
-          <w:lang w:val="de-DE"/>
-        </w:rPr>
-      </w:pPr>
-    </w:p>
     <w:p>
       <w:pPr>
         <w:rPr>

</xml_diff>